<commit_message>
docs: PAYF profile — demo video as the primary link, consent ticked
The showcase is read by ministers, partners and private-sector leaders,
so the main link is now the demo video of the machine running rather
than the source repository, which moves to the second field. The
consent box covers only the founder's own name and photo, and sending
the form is the act of consent, so it is ticked.

Co-Authored-By: Claude Opus 5 <noreply@anthropic.com>
Claude-Session: https://claude.ai/code/session_01XuNSKfFGFgyRA5WffAv1uC
</commit_message>
<xml_diff>
--- a/scratch/PAYF26_Digital_Profile_Forgeron_LamineSACKO.docx
+++ b/scratch/PAYF26_Digital_Profile_Forgeron_LamineSACKO.docx
@@ -286,7 +286,7 @@
                 <w:color w:val="626B76"/>
                 <w:sz w:val="22"/>
               </w:rPr>
-              <w:t>https://github.com/professeurp2/forgeron</w:t>
+              <w:t>https://youtu.be/DjL49i_IsJI</w:t>
             </w:r>
             <w:r>
               <w:rPr>
@@ -366,11 +366,11 @@
             </w:pPr>
             <w:r>
               <w:rPr>
-                <w:i/>
+                <w:i w:val="0"/>
                 <w:color w:val="626B76"/>
-                <w:sz w:val="19"/>
+                <w:sz w:val="22"/>
               </w:rPr>
-              <w:t>[Enter a relevant social-media link, if available]</w:t>
+              <w:t>https://github.com/professeurp2/forgeron</w:t>
             </w:r>
           </w:p>
         </w:tc>
@@ -426,7 +426,7 @@
         <w:rPr>
           <w:sz w:val="19"/>
         </w:rPr>
-        <w:t>☐  I agree that the information and photograph I submit may be used for the PAYF’26 digital profile display during the Forum.</w:t>
+        <w:t>☒  I agree that the information and photograph I submit may be used for the PAYF’26 digital profile display during the Forum.</w:t>
       </w:r>
     </w:p>
     <w:p>

</xml_diff>

<commit_message>
docs: PAYF profile — LinkedIn as the social link, video without timestamp
LinkedIn replaces the repository in the social-media field, since the
showcase exists so people can connect. The video link drops its &t=16s
so the profile opens on the first ten seconds, which carry the hook.

Co-Authored-By: Claude Opus 5 <noreply@anthropic.com>
Claude-Session: https://claude.ai/code/session_01XuNSKfFGFgyRA5WffAv1uC
</commit_message>
<xml_diff>
--- a/scratch/PAYF26_Digital_Profile_Forgeron_LamineSACKO.docx
+++ b/scratch/PAYF26_Digital_Profile_Forgeron_LamineSACKO.docx
@@ -286,7 +286,7 @@
                 <w:color w:val="626B76"/>
                 <w:sz w:val="22"/>
               </w:rPr>
-              <w:t>https://youtu.be/DjL49i_IsJI</w:t>
+              <w:t>https://www.youtube.com/watch?v=DjL49i_IsJI</w:t>
             </w:r>
             <w:r>
               <w:rPr>
@@ -370,7 +370,7 @@
                 <w:color w:val="626B76"/>
                 <w:sz w:val="22"/>
               </w:rPr>
-              <w:t>https://github.com/professeurp2/forgeron</w:t>
+              <w:t>https://www.linkedin.com/in/lamine-sacko-mecatronique/</w:t>
             </w:r>
           </w:p>
         </w:tc>

</xml_diff>